<commit_message>
weekly time log commit
</commit_message>
<xml_diff>
--- a/docs/Time Log Uliana.docx
+++ b/docs/Time Log Uliana.docx
@@ -1,6 +1,6 @@
 
 <file path=word/document.xml><?xml version="1.0" encoding="utf-8"?>
-<w:document xmlns:wpc="http://schemas.microsoft.com/office/word/2010/wordprocessingCanvas" xmlns:cx="http://schemas.microsoft.com/office/drawing/2014/chartex" xmlns:cx1="http://schemas.microsoft.com/office/drawing/2015/9/8/chartex" xmlns:cx2="http://schemas.microsoft.com/office/drawing/2015/10/21/chartex" xmlns:cx3="http://schemas.microsoft.com/office/drawing/2016/5/9/chartex" xmlns:cx4="http://schemas.microsoft.com/office/drawing/2016/5/10/chartex" xmlns:cx5="http://schemas.microsoft.com/office/drawing/2016/5/11/chartex" xmlns:cx6="http://schemas.microsoft.com/office/drawing/2016/5/12/chartex" xmlns:cx7="http://schemas.microsoft.com/office/drawing/2016/5/13/chartex" xmlns:cx8="http://schemas.microsoft.com/office/drawing/2016/5/14/chartex" xmlns:mc="http://schemas.openxmlformats.org/markup-compatibility/2006" xmlns:aink="http://schemas.microsoft.com/office/drawing/2016/ink" xmlns:am3d="http://schemas.microsoft.com/office/drawing/2017/model3d" xmlns:o="urn:schemas-microsoft-com:office:office" xmlns:oel="http://schemas.microsoft.com/office/2019/extlst" xmlns:r="http://schemas.openxmlformats.org/officeDocument/2006/relationships" xmlns:m="http://schemas.openxmlformats.org/officeDocument/2006/math" xmlns:v="urn:schemas-microsoft-com:vml" xmlns:wp14="http://schemas.microsoft.com/office/word/2010/wordprocessingDrawing" xmlns:wp="http://schemas.openxmlformats.org/drawingml/2006/wordprocessingDrawing" xmlns:w10="urn:schemas-microsoft-com:office:word" xmlns:w="http://schemas.openxmlformats.org/wordprocessingml/2006/main" xmlns:w14="http://schemas.microsoft.com/office/word/2010/wordml" xmlns:w15="http://schemas.microsoft.com/office/word/2012/wordml" xmlns:w16cex="http://schemas.microsoft.com/office/word/2018/wordml/cex" xmlns:w16cid="http://schemas.microsoft.com/office/word/2016/wordml/cid" xmlns:w16="http://schemas.microsoft.com/office/word/2018/wordml" xmlns:w16du="http://schemas.microsoft.com/office/word/2023/wordml/word16du" xmlns:w16sdtdh="http://schemas.microsoft.com/office/word/2020/wordml/sdtdatahash" xmlns:w16sdtfl="http://schemas.microsoft.com/office/word/2024/wordml/sdtformatlock" xmlns:w16se="http://schemas.microsoft.com/office/word/2015/wordml/symex" xmlns:wpg="http://schemas.microsoft.com/office/word/2010/wordprocessingGroup" xmlns:wpi="http://schemas.microsoft.com/office/word/2010/wordprocessingInk" xmlns:wne="http://schemas.microsoft.com/office/word/2006/wordml" xmlns:wps="http://schemas.microsoft.com/office/word/2010/wordprocessingShape" mc:Ignorable="w14 w15 w16se w16cid w16 w16cex w16sdtdh w16sdtfl w16du wp14">
+<w:document xmlns:wpc="http://schemas.microsoft.com/office/word/2010/wordprocessingCanvas" xmlns:cx="http://schemas.microsoft.com/office/drawing/2014/chartex" xmlns:cx1="http://schemas.microsoft.com/office/drawing/2015/9/8/chartex" xmlns:cx2="http://schemas.microsoft.com/office/drawing/2015/10/21/chartex" xmlns:cx3="http://schemas.microsoft.com/office/drawing/2016/5/9/chartex" xmlns:cx4="http://schemas.microsoft.com/office/drawing/2016/5/10/chartex" xmlns:cx5="http://schemas.microsoft.com/office/drawing/2016/5/11/chartex" xmlns:cx6="http://schemas.microsoft.com/office/drawing/2016/5/12/chartex" xmlns:cx7="http://schemas.microsoft.com/office/drawing/2016/5/13/chartex" xmlns:cx8="http://schemas.microsoft.com/office/drawing/2016/5/14/chartex" xmlns:mc="http://schemas.openxmlformats.org/markup-compatibility/2006" xmlns:aink="http://schemas.microsoft.com/office/drawing/2016/ink" xmlns:am3d="http://schemas.microsoft.com/office/drawing/2017/model3d" xmlns:o="urn:schemas-microsoft-com:office:office" xmlns:r="http://schemas.openxmlformats.org/officeDocument/2006/relationships" xmlns:m="http://schemas.openxmlformats.org/officeDocument/2006/math" xmlns:v="urn:schemas-microsoft-com:vml" xmlns:wp14="http://schemas.microsoft.com/office/word/2010/wordprocessingDrawing" xmlns:wp="http://schemas.openxmlformats.org/drawingml/2006/wordprocessingDrawing" xmlns:w10="urn:schemas-microsoft-com:office:word" xmlns:w="http://schemas.openxmlformats.org/wordprocessingml/2006/main" xmlns:w14="http://schemas.microsoft.com/office/word/2010/wordml" xmlns:w15="http://schemas.microsoft.com/office/word/2012/wordml" xmlns:w16cex="http://schemas.microsoft.com/office/word/2018/wordml/cex" xmlns:w16cid="http://schemas.microsoft.com/office/word/2016/wordml/cid" xmlns:w16="http://schemas.microsoft.com/office/word/2018/wordml" xmlns:w16sdtdh="http://schemas.microsoft.com/office/word/2020/wordml/sdtdatahash" xmlns:w16se="http://schemas.microsoft.com/office/word/2015/wordml/symex" xmlns:wpg="http://schemas.microsoft.com/office/word/2010/wordprocessingGroup" xmlns:wpi="http://schemas.microsoft.com/office/word/2010/wordprocessingInk" xmlns:wne="http://schemas.microsoft.com/office/word/2006/wordml" xmlns:wps="http://schemas.microsoft.com/office/word/2010/wordprocessingShape" mc:Ignorable="w14 w15 w16se w16cid w16 w16cex w16sdtdh wp14">
   <w:body>
     <w:p>
       <w:pPr>
@@ -13,9 +13,18 @@
     <w:p>
       <w:pPr>
         <w:jc w:val="center"/>
+        <w:rPr>
+          <w:lang w:val="uk-UA"/>
+        </w:rPr>
       </w:pPr>
       <w:r>
-        <w:t>Name: Val Kolesnikov</w:t>
+        <w:t>Name:</w:t>
+      </w:r>
+      <w:r>
+        <w:t xml:space="preserve"> Uliana Sova</w:t>
+      </w:r>
+      <w:r>
+        <w:t xml:space="preserve"> </w:t>
       </w:r>
     </w:p>
     <w:p>
@@ -23,7 +32,7 @@
         <w:jc w:val="center"/>
       </w:pPr>
       <w:r>
-        <w:t>Project: EDU Suite</w:t>
+        <w:t xml:space="preserve">Project LMS: </w:t>
       </w:r>
     </w:p>
     <w:p>
@@ -33,9 +42,19 @@
     </w:p>
     <w:tbl>
       <w:tblPr>
-        <w:tblStyle w:val="TableGrid"/>
-        <w:tblW w:w="0" w:type="auto"/>
-        <w:tblLook w:val="04A0" w:firstRow="1" w:lastRow="0" w:firstColumn="1" w:lastColumn="0" w:noHBand="0" w:noVBand="1"/>
+        <w:tblStyle w:val="a"/>
+        <w:tblW w:w="9576" w:type="dxa"/>
+        <w:tblInd w:w="-108" w:type="dxa"/>
+        <w:tblBorders>
+          <w:top w:val="single" w:sz="4" w:space="0" w:color="000000"/>
+          <w:left w:val="single" w:sz="4" w:space="0" w:color="000000"/>
+          <w:bottom w:val="single" w:sz="4" w:space="0" w:color="000000"/>
+          <w:right w:val="single" w:sz="4" w:space="0" w:color="000000"/>
+          <w:insideH w:val="single" w:sz="4" w:space="0" w:color="000000"/>
+          <w:insideV w:val="single" w:sz="4" w:space="0" w:color="000000"/>
+        </w:tblBorders>
+        <w:tblLayout w:type="fixed"/>
+        <w:tblLook w:val="0400" w:firstRow="0" w:lastRow="0" w:firstColumn="0" w:lastColumn="0" w:noHBand="0" w:noVBand="1"/>
       </w:tblPr>
       <w:tblGrid>
         <w:gridCol w:w="1819"/>
@@ -46,6 +65,9 @@
         <w:gridCol w:w="1511"/>
       </w:tblGrid>
       <w:tr>
+        <w:trPr>
+          <w:tblHeader/>
+        </w:trPr>
         <w:tc>
           <w:tcPr>
             <w:tcW w:w="1819" w:type="dxa"/>
@@ -120,12 +142,15 @@
               <w:jc w:val="center"/>
             </w:pPr>
             <w:r>
-              <w:sym w:font="Symbol" w:char="F044"/>
+              <w:t>Δ</w:t>
             </w:r>
           </w:p>
         </w:tc>
       </w:tr>
       <w:tr>
+        <w:trPr>
+          <w:tblHeader/>
+        </w:trPr>
         <w:tc>
           <w:tcPr>
             <w:tcW w:w="1819" w:type="dxa"/>
@@ -137,16 +162,7 @@
           </w:p>
           <w:p>
             <w:r>
-              <w:t>09/05/</w:t>
-            </w:r>
-            <w:r>
-              <w:t>26</w:t>
-            </w:r>
-            <w:r>
-              <w:t>- 09/11/</w:t>
-            </w:r>
-            <w:r>
-              <w:t>26</w:t>
+              <w:t>09/14/26- 09/20/26</w:t>
             </w:r>
           </w:p>
         </w:tc>
@@ -156,7 +172,7 @@
           </w:tcPr>
           <w:p>
             <w:r>
-              <w:t>Interview with Dr. Long</w:t>
+              <w:t>Group meeting</w:t>
             </w:r>
           </w:p>
         </w:tc>
@@ -166,7 +182,7 @@
           </w:tcPr>
           <w:p>
             <w:r>
-              <w:t>09/10/10</w:t>
+              <w:t>09/17/26</w:t>
             </w:r>
           </w:p>
         </w:tc>
@@ -176,7 +192,7 @@
           </w:tcPr>
           <w:p>
             <w:r>
-              <w:t>6:00 am</w:t>
+              <w:t>4:00 pm</w:t>
             </w:r>
           </w:p>
         </w:tc>
@@ -186,7 +202,7 @@
           </w:tcPr>
           <w:p>
             <w:r>
-              <w:t>6:30 am</w:t>
+              <w:t>5:05 pm</w:t>
             </w:r>
           </w:p>
         </w:tc>
@@ -196,12 +212,15 @@
           </w:tcPr>
           <w:p>
             <w:r>
-              <w:t>30 min</w:t>
+              <w:t>65 min</w:t>
             </w:r>
           </w:p>
         </w:tc>
       </w:tr>
       <w:tr>
+        <w:trPr>
+          <w:tblHeader/>
+        </w:trPr>
         <w:tc>
           <w:tcPr>
             <w:tcW w:w="1819" w:type="dxa"/>
@@ -214,8 +233,13 @@
           </w:tcPr>
           <w:p>
             <w:r>
-              <w:t>Summarizing interview with Dr. Long</w:t>
-            </w:r>
+              <w:t xml:space="preserve">GitHub </w:t>
+            </w:r>
+            <w:proofErr w:type="spellStart"/>
+            <w:r>
+              <w:t>init</w:t>
+            </w:r>
+            <w:proofErr w:type="spellEnd"/>
           </w:p>
         </w:tc>
         <w:tc>
@@ -224,7 +248,13 @@
           </w:tcPr>
           <w:p>
             <w:r>
-              <w:t>09/10/10</w:t>
+              <w:t>09/1</w:t>
+            </w:r>
+            <w:r>
+              <w:t>7</w:t>
+            </w:r>
+            <w:r>
+              <w:t>/26</w:t>
             </w:r>
           </w:p>
         </w:tc>
@@ -234,7 +264,16 @@
           </w:tcPr>
           <w:p>
             <w:r>
-              <w:t>10:00 pm</w:t>
+              <w:t>5</w:t>
+            </w:r>
+            <w:r>
+              <w:t>:</w:t>
+            </w:r>
+            <w:r>
+              <w:t>10</w:t>
+            </w:r>
+            <w:r>
+              <w:t xml:space="preserve"> pm</w:t>
             </w:r>
           </w:p>
         </w:tc>
@@ -244,7 +283,7 @@
           </w:tcPr>
           <w:p>
             <w:r>
-              <w:t>11:18 pm</w:t>
+              <w:t>5:30 pm</w:t>
             </w:r>
           </w:p>
         </w:tc>
@@ -254,12 +293,18 @@
           </w:tcPr>
           <w:p>
             <w:r>
-              <w:t>78 min</w:t>
+              <w:t>2</w:t>
+            </w:r>
+            <w:r>
+              <w:t>0 min</w:t>
             </w:r>
           </w:p>
         </w:tc>
       </w:tr>
       <w:tr>
+        <w:trPr>
+          <w:tblHeader/>
+        </w:trPr>
         <w:tc>
           <w:tcPr>
             <w:tcW w:w="1819" w:type="dxa"/>
@@ -270,25 +315,41 @@
           <w:tcPr>
             <w:tcW w:w="1773" w:type="dxa"/>
           </w:tcPr>
-          <w:p/>
+          <w:p>
+            <w:r>
+              <w:t>Stakeholder questions overview</w:t>
+            </w:r>
+          </w:p>
         </w:tc>
         <w:tc>
           <w:tcPr>
             <w:tcW w:w="1322" w:type="dxa"/>
           </w:tcPr>
-          <w:p/>
+          <w:p>
+            <w:r>
+              <w:t>09/19/26</w:t>
+            </w:r>
+          </w:p>
         </w:tc>
         <w:tc>
           <w:tcPr>
             <w:tcW w:w="1516" w:type="dxa"/>
           </w:tcPr>
-          <w:p/>
+          <w:p>
+            <w:r>
+              <w:t>7:10 am</w:t>
+            </w:r>
+          </w:p>
         </w:tc>
         <w:tc>
           <w:tcPr>
             <w:tcW w:w="1635" w:type="dxa"/>
           </w:tcPr>
-          <w:p/>
+          <w:p>
+            <w:r>
+              <w:t>7:30 am</w:t>
+            </w:r>
+          </w:p>
         </w:tc>
         <w:tc>
           <w:tcPr>
@@ -296,12 +357,123 @@
           </w:tcPr>
           <w:p>
             <w:r>
-              <w:t xml:space="preserve">Week total: </w:t>
-            </w:r>
-          </w:p>
-          <w:p>
-            <w:r>
-              <w:t>108 min</w:t>
+              <w:t>20 min</w:t>
+            </w:r>
+          </w:p>
+        </w:tc>
+      </w:tr>
+      <w:tr>
+        <w:trPr>
+          <w:tblHeader/>
+        </w:trPr>
+        <w:tc>
+          <w:tcPr>
+            <w:tcW w:w="1819" w:type="dxa"/>
+          </w:tcPr>
+          <w:p/>
+        </w:tc>
+        <w:tc>
+          <w:tcPr>
+            <w:tcW w:w="1773" w:type="dxa"/>
+          </w:tcPr>
+          <w:p>
+            <w:r>
+              <w:t xml:space="preserve">Jira </w:t>
+            </w:r>
+            <w:proofErr w:type="spellStart"/>
+            <w:r>
+              <w:t>init</w:t>
+            </w:r>
+            <w:proofErr w:type="spellEnd"/>
+          </w:p>
+        </w:tc>
+        <w:tc>
+          <w:tcPr>
+            <w:tcW w:w="1322" w:type="dxa"/>
+          </w:tcPr>
+          <w:p>
+            <w:r>
+              <w:t>09/19/26</w:t>
+            </w:r>
+          </w:p>
+        </w:tc>
+        <w:tc>
+          <w:tcPr>
+            <w:tcW w:w="1516" w:type="dxa"/>
+          </w:tcPr>
+          <w:p>
+            <w:r>
+              <w:t>7:30 am</w:t>
+            </w:r>
+          </w:p>
+        </w:tc>
+        <w:tc>
+          <w:tcPr>
+            <w:tcW w:w="1635" w:type="dxa"/>
+          </w:tcPr>
+          <w:p>
+            <w:r>
+              <w:t>8:30 am</w:t>
+            </w:r>
+          </w:p>
+        </w:tc>
+        <w:tc>
+          <w:tcPr>
+            <w:tcW w:w="1511" w:type="dxa"/>
+          </w:tcPr>
+          <w:p>
+            <w:r>
+              <w:t>60 min</w:t>
+            </w:r>
+          </w:p>
+        </w:tc>
+      </w:tr>
+      <w:tr>
+        <w:trPr>
+          <w:tblHeader/>
+        </w:trPr>
+        <w:tc>
+          <w:tcPr>
+            <w:tcW w:w="1819" w:type="dxa"/>
+          </w:tcPr>
+          <w:p/>
+        </w:tc>
+        <w:tc>
+          <w:tcPr>
+            <w:tcW w:w="1773" w:type="dxa"/>
+          </w:tcPr>
+          <w:p/>
+        </w:tc>
+        <w:tc>
+          <w:tcPr>
+            <w:tcW w:w="1322" w:type="dxa"/>
+          </w:tcPr>
+          <w:p/>
+        </w:tc>
+        <w:tc>
+          <w:tcPr>
+            <w:tcW w:w="1516" w:type="dxa"/>
+          </w:tcPr>
+          <w:p/>
+        </w:tc>
+        <w:tc>
+          <w:tcPr>
+            <w:tcW w:w="1635" w:type="dxa"/>
+          </w:tcPr>
+          <w:p/>
+        </w:tc>
+        <w:tc>
+          <w:tcPr>
+            <w:tcW w:w="1511" w:type="dxa"/>
+          </w:tcPr>
+          <w:p>
+            <w:r>
+              <w:t>Week total:</w:t>
+            </w:r>
+          </w:p>
+          <w:p>
+            <w:r>
+              <w:t>165 min</w:t>
             </w:r>
           </w:p>
         </w:tc>
@@ -430,22 +602,22 @@
     <w:sectPr>
       <w:pgSz w:w="12240" w:h="15840"/>
       <w:pgMar w:top="1440" w:right="1440" w:bottom="1440" w:left="1440" w:header="720" w:footer="720" w:gutter="0"/>
+      <w:pgNumType w:start="1"/>
       <w:cols w:space="720"/>
-      <w:docGrid w:linePitch="360"/>
     </w:sectPr>
   </w:body>
 </w:document>
 </file>
 
 <file path=word/styles.xml><?xml version="1.0" encoding="utf-8"?>
-<w:styles xmlns:mc="http://schemas.openxmlformats.org/markup-compatibility/2006" xmlns:r="http://schemas.openxmlformats.org/officeDocument/2006/relationships" xmlns:w="http://schemas.openxmlformats.org/wordprocessingml/2006/main" xmlns:w14="http://schemas.microsoft.com/office/word/2010/wordml" xmlns:w15="http://schemas.microsoft.com/office/word/2012/wordml" xmlns:w16cex="http://schemas.microsoft.com/office/word/2018/wordml/cex" xmlns:w16cid="http://schemas.microsoft.com/office/word/2016/wordml/cid" xmlns:w16="http://schemas.microsoft.com/office/word/2018/wordml" xmlns:w16du="http://schemas.microsoft.com/office/word/2023/wordml/word16du" xmlns:w16sdtdh="http://schemas.microsoft.com/office/word/2020/wordml/sdtdatahash" xmlns:w16sdtfl="http://schemas.microsoft.com/office/word/2024/wordml/sdtformatlock" xmlns:w16se="http://schemas.microsoft.com/office/word/2015/wordml/symex" mc:Ignorable="w14 w15 w16se w16cid w16 w16cex w16sdtdh w16sdtfl w16du">
+<w:styles xmlns:mc="http://schemas.openxmlformats.org/markup-compatibility/2006" xmlns:r="http://schemas.openxmlformats.org/officeDocument/2006/relationships" xmlns:w="http://schemas.openxmlformats.org/wordprocessingml/2006/main" xmlns:w14="http://schemas.microsoft.com/office/word/2010/wordml" xmlns:w15="http://schemas.microsoft.com/office/word/2012/wordml" xmlns:w16cex="http://schemas.microsoft.com/office/word/2018/wordml/cex" xmlns:w16cid="http://schemas.microsoft.com/office/word/2016/wordml/cid" xmlns:w16="http://schemas.microsoft.com/office/word/2018/wordml" xmlns:w16sdtdh="http://schemas.microsoft.com/office/word/2020/wordml/sdtdatahash" xmlns:w16se="http://schemas.microsoft.com/office/word/2015/wordml/symex" mc:Ignorable="w14 w15 w16se w16cid w16 w16cex w16sdtdh">
   <w:docDefaults>
     <w:rPrDefault>
       <w:rPr>
-        <w:rFonts w:asciiTheme="minorHAnsi" w:eastAsiaTheme="minorHAnsi" w:hAnsiTheme="minorHAnsi" w:cstheme="minorBidi"/>
+        <w:rFonts w:ascii="Calibri" w:eastAsia="Calibri" w:hAnsi="Calibri" w:cs="Calibri"/>
         <w:sz w:val="22"/>
         <w:szCs w:val="22"/>
-        <w:lang w:val="en-US" w:eastAsia="en-US" w:bidi="ar-SA"/>
+        <w:lang w:val="en" w:eastAsia="uk-UA" w:bidi="ar-SA"/>
       </w:rPr>
     </w:rPrDefault>
     <w:pPrDefault>
@@ -609,7 +781,7 @@
     <w:lsdException w:name="Table Web 2" w:semiHidden="1" w:unhideWhenUsed="1"/>
     <w:lsdException w:name="Table Web 3" w:semiHidden="1" w:unhideWhenUsed="1"/>
     <w:lsdException w:name="Balloon Text" w:semiHidden="1" w:unhideWhenUsed="1"/>
-    <w:lsdException w:name="Table Grid" w:uiPriority="59"/>
+    <w:lsdException w:name="Table Grid" w:uiPriority="39"/>
     <w:lsdException w:name="Table Theme" w:semiHidden="1" w:unhideWhenUsed="1"/>
     <w:lsdException w:name="Placeholder Text" w:semiHidden="1"/>
     <w:lsdException w:name="No Spacing" w:uiPriority="1" w:qFormat="1"/>
@@ -835,7 +1007,128 @@
   <w:style w:type="paragraph" w:default="1" w:styleId="Normal">
     <w:name w:val="Normal"/>
     <w:qFormat/>
-    <w:rsid w:val="00562690"/>
+  </w:style>
+  <w:style w:type="paragraph" w:styleId="Heading1">
+    <w:name w:val="heading 1"/>
+    <w:basedOn w:val="Normal"/>
+    <w:next w:val="Normal"/>
+    <w:uiPriority w:val="9"/>
+    <w:qFormat/>
+    <w:pPr>
+      <w:keepNext/>
+      <w:keepLines/>
+      <w:spacing w:before="480" w:after="120"/>
+      <w:outlineLvl w:val="0"/>
+    </w:pPr>
+    <w:rPr>
+      <w:b/>
+      <w:bCs/>
+      <w:sz w:val="48"/>
+      <w:szCs w:val="48"/>
+    </w:rPr>
+  </w:style>
+  <w:style w:type="paragraph" w:styleId="Heading2">
+    <w:name w:val="heading 2"/>
+    <w:basedOn w:val="Normal"/>
+    <w:next w:val="Normal"/>
+    <w:uiPriority w:val="9"/>
+    <w:semiHidden/>
+    <w:unhideWhenUsed/>
+    <w:qFormat/>
+    <w:pPr>
+      <w:keepNext/>
+      <w:keepLines/>
+      <w:spacing w:before="360" w:after="80"/>
+      <w:outlineLvl w:val="1"/>
+    </w:pPr>
+    <w:rPr>
+      <w:b/>
+      <w:bCs/>
+      <w:sz w:val="36"/>
+      <w:szCs w:val="36"/>
+    </w:rPr>
+  </w:style>
+  <w:style w:type="paragraph" w:styleId="Heading3">
+    <w:name w:val="heading 3"/>
+    <w:basedOn w:val="Normal"/>
+    <w:next w:val="Normal"/>
+    <w:uiPriority w:val="9"/>
+    <w:semiHidden/>
+    <w:unhideWhenUsed/>
+    <w:qFormat/>
+    <w:pPr>
+      <w:keepNext/>
+      <w:keepLines/>
+      <w:spacing w:before="280" w:after="80"/>
+      <w:outlineLvl w:val="2"/>
+    </w:pPr>
+    <w:rPr>
+      <w:b/>
+      <w:bCs/>
+      <w:sz w:val="28"/>
+      <w:szCs w:val="28"/>
+    </w:rPr>
+  </w:style>
+  <w:style w:type="paragraph" w:styleId="Heading4">
+    <w:name w:val="heading 4"/>
+    <w:basedOn w:val="Normal"/>
+    <w:next w:val="Normal"/>
+    <w:uiPriority w:val="9"/>
+    <w:semiHidden/>
+    <w:unhideWhenUsed/>
+    <w:qFormat/>
+    <w:pPr>
+      <w:keepNext/>
+      <w:keepLines/>
+      <w:spacing w:before="240" w:after="40"/>
+      <w:outlineLvl w:val="3"/>
+    </w:pPr>
+    <w:rPr>
+      <w:b/>
+      <w:bCs/>
+      <w:sz w:val="24"/>
+      <w:szCs w:val="24"/>
+    </w:rPr>
+  </w:style>
+  <w:style w:type="paragraph" w:styleId="Heading5">
+    <w:name w:val="heading 5"/>
+    <w:basedOn w:val="Normal"/>
+    <w:next w:val="Normal"/>
+    <w:uiPriority w:val="9"/>
+    <w:semiHidden/>
+    <w:unhideWhenUsed/>
+    <w:qFormat/>
+    <w:pPr>
+      <w:keepNext/>
+      <w:keepLines/>
+      <w:spacing w:before="220" w:after="40"/>
+      <w:outlineLvl w:val="4"/>
+    </w:pPr>
+    <w:rPr>
+      <w:b/>
+      <w:bCs/>
+    </w:rPr>
+  </w:style>
+  <w:style w:type="paragraph" w:styleId="Heading6">
+    <w:name w:val="heading 6"/>
+    <w:basedOn w:val="Normal"/>
+    <w:next w:val="Normal"/>
+    <w:uiPriority w:val="9"/>
+    <w:semiHidden/>
+    <w:unhideWhenUsed/>
+    <w:qFormat/>
+    <w:pPr>
+      <w:keepNext/>
+      <w:keepLines/>
+      <w:spacing w:before="200" w:after="40"/>
+      <w:outlineLvl w:val="5"/>
+    </w:pPr>
+    <w:rPr>
+      <w:b/>
+      <w:bCs/>
+      <w:sz w:val="20"/>
+      <w:szCs w:val="20"/>
+    </w:rPr>
   </w:style>
   <w:style w:type="character" w:default="1" w:styleId="DefaultParagraphFont">
     <w:name w:val="Default Paragraph Font"/>
@@ -864,23 +1157,69 @@
     <w:semiHidden/>
     <w:unhideWhenUsed/>
   </w:style>
-  <w:style w:type="table" w:styleId="TableGrid">
-    <w:name w:val="Table Grid"/>
-    <w:basedOn w:val="TableNormal"/>
-    <w:uiPriority w:val="59"/>
-    <w:rsid w:val="00E477D3"/>
+  <w:style w:type="table" w:customStyle="1" w:styleId="TableNormal0">
+    <w:name w:val="TableNormal"/>
+    <w:tblPr>
+      <w:tblCellMar>
+        <w:top w:w="100" w:type="dxa"/>
+        <w:left w:w="100" w:type="dxa"/>
+        <w:bottom w:w="100" w:type="dxa"/>
+        <w:right w:w="100" w:type="dxa"/>
+      </w:tblCellMar>
+    </w:tblPr>
+  </w:style>
+  <w:style w:type="paragraph" w:styleId="Title">
+    <w:name w:val="Title"/>
+    <w:basedOn w:val="Normal"/>
+    <w:next w:val="Normal"/>
+    <w:uiPriority w:val="10"/>
+    <w:qFormat/>
+    <w:pPr>
+      <w:keepNext/>
+      <w:keepLines/>
+      <w:spacing w:before="480" w:after="120"/>
+    </w:pPr>
+    <w:rPr>
+      <w:b/>
+      <w:bCs/>
+      <w:sz w:val="72"/>
+      <w:szCs w:val="72"/>
+    </w:rPr>
+  </w:style>
+  <w:style w:type="paragraph" w:styleId="Subtitle">
+    <w:name w:val="Subtitle"/>
+    <w:basedOn w:val="Normal"/>
+    <w:next w:val="Normal"/>
+    <w:uiPriority w:val="11"/>
+    <w:qFormat/>
+    <w:pPr>
+      <w:keepNext/>
+      <w:keepLines/>
+      <w:spacing w:before="360" w:after="80"/>
+    </w:pPr>
+    <w:rPr>
+      <w:rFonts w:ascii="Georgia" w:eastAsia="Georgia" w:hAnsi="Georgia" w:cs="Georgia"/>
+      <w:i/>
+      <w:iCs/>
+      <w:color w:val="666666"/>
+      <w:sz w:val="48"/>
+      <w:szCs w:val="48"/>
+    </w:rPr>
+  </w:style>
+  <w:style w:type="table" w:customStyle="1" w:styleId="a">
+    <w:basedOn w:val="TableNormal0"/>
     <w:pPr>
       <w:spacing w:after="0" w:line="240" w:lineRule="auto"/>
     </w:pPr>
     <w:tblPr>
-      <w:tblBorders>
-        <w:top w:val="single" w:sz="4" w:space="0" w:color="000000" w:themeColor="text1"/>
-        <w:left w:val="single" w:sz="4" w:space="0" w:color="000000" w:themeColor="text1"/>
-        <w:bottom w:val="single" w:sz="4" w:space="0" w:color="000000" w:themeColor="text1"/>
-        <w:right w:val="single" w:sz="4" w:space="0" w:color="000000" w:themeColor="text1"/>
-        <w:insideH w:val="single" w:sz="4" w:space="0" w:color="000000" w:themeColor="text1"/>
-        <w:insideV w:val="single" w:sz="4" w:space="0" w:color="000000" w:themeColor="text1"/>
-      </w:tblBorders>
+      <w:tblStyleRowBandSize w:val="1"/>
+      <w:tblStyleColBandSize w:val="1"/>
+      <w:tblCellMar>
+        <w:top w:w="0" w:type="dxa"/>
+        <w:left w:w="108" w:type="dxa"/>
+        <w:bottom w:w="0" w:type="dxa"/>
+        <w:right w:w="108" w:type="dxa"/>
+      </w:tblCellMar>
     </w:tblPr>
   </w:style>
 </w:styles>
@@ -929,7 +1268,7 @@
     </a:clrScheme>
     <a:fontScheme name="Office">
       <a:majorFont>
-        <a:latin typeface="Cambria"/>
+        <a:latin typeface="Calibri"/>
         <a:ea typeface=""/>
         <a:cs typeface=""/>
         <a:font script="Jpan" typeface="ＭＳ ゴシック"/>
@@ -961,9 +1300,10 @@
         <a:font script="Mong" typeface="Mongolian Baiti"/>
         <a:font script="Viet" typeface="Times New Roman"/>
         <a:font script="Uigh" typeface="Microsoft Uighur"/>
+        <a:font script="Geor" typeface="Sylfaen"/>
       </a:majorFont>
       <a:minorFont>
-        <a:latin typeface="Calibri"/>
+        <a:latin typeface="Cambria"/>
         <a:ea typeface=""/>
         <a:cs typeface=""/>
         <a:font script="Jpan" typeface="ＭＳ 明朝"/>
@@ -995,6 +1335,7 @@
         <a:font script="Mong" typeface="Mongolian Baiti"/>
         <a:font script="Viet" typeface="Arial"/>
         <a:font script="Uigh" typeface="Microsoft Uighur"/>
+        <a:font script="Geor" typeface="Sylfaen"/>
       </a:minorFont>
     </a:fontScheme>
     <a:fmtScheme name="Office">
@@ -1029,20 +1370,16 @@
           <a:gsLst>
             <a:gs pos="0">
               <a:schemeClr val="phClr">
-                <a:shade val="51000"/>
-                <a:satMod val="130000"/>
-              </a:schemeClr>
-            </a:gs>
-            <a:gs pos="80000">
-              <a:schemeClr val="phClr">
-                <a:shade val="93000"/>
+                <a:tint val="100000"/>
+                <a:shade val="100000"/>
                 <a:satMod val="130000"/>
               </a:schemeClr>
             </a:gs>
             <a:gs pos="100000">
               <a:schemeClr val="phClr">
-                <a:shade val="94000"/>
-                <a:satMod val="135000"/>
+                <a:tint val="50000"/>
+                <a:shade val="100000"/>
+                <a:satMod val="350000"/>
               </a:schemeClr>
             </a:gs>
           </a:gsLst>
@@ -1164,7 +1501,46 @@
       </a:bgFillStyleLst>
     </a:fmtScheme>
   </a:themeElements>
-  <a:objectDefaults/>
+  <a:objectDefaults>
+    <a:spDef>
+      <a:spPr/>
+      <a:bodyPr/>
+      <a:lstStyle/>
+      <a:style>
+        <a:lnRef idx="1">
+          <a:schemeClr val="accent1"/>
+        </a:lnRef>
+        <a:fillRef idx="3">
+          <a:schemeClr val="accent1"/>
+        </a:fillRef>
+        <a:effectRef idx="2">
+          <a:schemeClr val="accent1"/>
+        </a:effectRef>
+        <a:fontRef idx="minor">
+          <a:schemeClr val="lt1"/>
+        </a:fontRef>
+      </a:style>
+    </a:spDef>
+    <a:lnDef>
+      <a:spPr/>
+      <a:bodyPr/>
+      <a:lstStyle/>
+      <a:style>
+        <a:lnRef idx="2">
+          <a:schemeClr val="accent1"/>
+        </a:lnRef>
+        <a:fillRef idx="0">
+          <a:schemeClr val="accent1"/>
+        </a:fillRef>
+        <a:effectRef idx="1">
+          <a:schemeClr val="accent1"/>
+        </a:effectRef>
+        <a:fontRef idx="minor">
+          <a:schemeClr val="tx1"/>
+        </a:fontRef>
+      </a:style>
+    </a:lnDef>
+  </a:objectDefaults>
   <a:extraClrSchemeLst/>
 </a:theme>
 </file>
</xml_diff>

<commit_message>
weekly time log commit 09/21/26-09/28/26
</commit_message>
<xml_diff>
--- a/docs/Time Log Uliana.docx
+++ b/docs/Time Log Uliana.docx
@@ -233,13 +233,8 @@
           </w:tcPr>
           <w:p>
             <w:r>
-              <w:t xml:space="preserve">GitHub </w:t>
-            </w:r>
-            <w:proofErr w:type="spellStart"/>
-            <w:r>
-              <w:t>init</w:t>
-            </w:r>
-            <w:proofErr w:type="spellEnd"/>
+              <w:t>GitHub init</w:t>
+            </w:r>
           </w:p>
         </w:tc>
         <w:tc>
@@ -378,13 +373,8 @@
           </w:tcPr>
           <w:p>
             <w:r>
-              <w:t xml:space="preserve">Jira </w:t>
-            </w:r>
-            <w:proofErr w:type="spellStart"/>
-            <w:r>
-              <w:t>init</w:t>
-            </w:r>
-            <w:proofErr w:type="spellEnd"/>
+              <w:t>Jira init</w:t>
+            </w:r>
           </w:p>
         </w:tc>
         <w:tc>
@@ -479,46 +469,78 @@
         </w:tc>
       </w:tr>
       <w:tr>
+        <w:trPr>
+          <w:tblHeader/>
+        </w:trPr>
         <w:tc>
           <w:tcPr>
             <w:tcW w:w="1819" w:type="dxa"/>
           </w:tcPr>
           <w:p>
             <w:r>
-              <w:t>Week 2 ...</w:t>
-            </w:r>
-          </w:p>
-          <w:p/>
+              <w:t>Week 2:</w:t>
+            </w:r>
+          </w:p>
+          <w:p>
+            <w:r>
+              <w:t>09/21/26-</w:t>
+            </w:r>
+          </w:p>
+          <w:p>
+            <w:r>
+              <w:t>09/28/26</w:t>
+            </w:r>
+          </w:p>
         </w:tc>
         <w:tc>
           <w:tcPr>
             <w:tcW w:w="1773" w:type="dxa"/>
           </w:tcPr>
-          <w:p/>
+          <w:p>
+            <w:r>
+              <w:t xml:space="preserve">Questions for stakeholders </w:t>
+            </w:r>
+          </w:p>
         </w:tc>
         <w:tc>
           <w:tcPr>
             <w:tcW w:w="1322" w:type="dxa"/>
           </w:tcPr>
-          <w:p/>
+          <w:p>
+            <w:r>
+              <w:t>09/22/26</w:t>
+            </w:r>
+          </w:p>
         </w:tc>
         <w:tc>
           <w:tcPr>
             <w:tcW w:w="1516" w:type="dxa"/>
           </w:tcPr>
-          <w:p/>
+          <w:p>
+            <w:r>
+              <w:t xml:space="preserve">13:00 </w:t>
+            </w:r>
+          </w:p>
         </w:tc>
         <w:tc>
           <w:tcPr>
             <w:tcW w:w="1635" w:type="dxa"/>
           </w:tcPr>
-          <w:p/>
+          <w:p>
+            <w:r>
+              <w:t>14:00</w:t>
+            </w:r>
+          </w:p>
         </w:tc>
         <w:tc>
           <w:tcPr>
             <w:tcW w:w="1511" w:type="dxa"/>
           </w:tcPr>
-          <w:p/>
+          <w:p>
+            <w:r>
+              <w:t>60 min</w:t>
+            </w:r>
+          </w:p>
         </w:tc>
       </w:tr>
       <w:tr>
@@ -532,31 +554,51 @@
           <w:tcPr>
             <w:tcW w:w="1773" w:type="dxa"/>
           </w:tcPr>
-          <w:p/>
+          <w:p>
+            <w:r>
+              <w:t>Requirements gathering</w:t>
+            </w:r>
+          </w:p>
         </w:tc>
         <w:tc>
           <w:tcPr>
             <w:tcW w:w="1322" w:type="dxa"/>
           </w:tcPr>
-          <w:p/>
+          <w:p>
+            <w:r>
+              <w:t>09/24/26</w:t>
+            </w:r>
+          </w:p>
         </w:tc>
         <w:tc>
           <w:tcPr>
             <w:tcW w:w="1516" w:type="dxa"/>
           </w:tcPr>
-          <w:p/>
+          <w:p>
+            <w:r>
+              <w:t xml:space="preserve">12:30 </w:t>
+            </w:r>
+          </w:p>
         </w:tc>
         <w:tc>
           <w:tcPr>
             <w:tcW w:w="1635" w:type="dxa"/>
           </w:tcPr>
-          <w:p/>
+          <w:p>
+            <w:r>
+              <w:t>13:00</w:t>
+            </w:r>
+          </w:p>
         </w:tc>
         <w:tc>
           <w:tcPr>
             <w:tcW w:w="1511" w:type="dxa"/>
           </w:tcPr>
-          <w:p/>
+          <w:p>
+            <w:r>
+              <w:t>30 min</w:t>
+            </w:r>
+          </w:p>
         </w:tc>
       </w:tr>
       <w:tr>
@@ -570,16 +612,132 @@
           <w:tcPr>
             <w:tcW w:w="1773" w:type="dxa"/>
           </w:tcPr>
+          <w:p>
+            <w:r>
+              <w:t>Jira schedule setup</w:t>
+            </w:r>
+          </w:p>
+        </w:tc>
+        <w:tc>
+          <w:tcPr>
+            <w:tcW w:w="1322" w:type="dxa"/>
+          </w:tcPr>
+          <w:p>
+            <w:r>
+              <w:t>09/24/26</w:t>
+            </w:r>
+          </w:p>
+        </w:tc>
+        <w:tc>
+          <w:tcPr>
+            <w:tcW w:w="1516" w:type="dxa"/>
+          </w:tcPr>
+          <w:p>
+            <w:r>
+              <w:t xml:space="preserve">14:30 </w:t>
+            </w:r>
+          </w:p>
+        </w:tc>
+        <w:tc>
+          <w:tcPr>
+            <w:tcW w:w="1635" w:type="dxa"/>
+          </w:tcPr>
+          <w:p>
+            <w:r>
+              <w:t xml:space="preserve">16:30 </w:t>
+            </w:r>
+          </w:p>
+        </w:tc>
+        <w:tc>
+          <w:tcPr>
+            <w:tcW w:w="1511" w:type="dxa"/>
+          </w:tcPr>
+          <w:p>
+            <w:r>
+              <w:t>120 min</w:t>
+            </w:r>
+          </w:p>
+        </w:tc>
+      </w:tr>
+      <w:tr>
+        <w:tc>
+          <w:tcPr>
+            <w:tcW w:w="1819" w:type="dxa"/>
+          </w:tcPr>
           <w:p/>
         </w:tc>
         <w:tc>
           <w:tcPr>
+            <w:tcW w:w="1773" w:type="dxa"/>
+          </w:tcPr>
+          <w:p>
+            <w:r>
+              <w:t>Report check</w:t>
+            </w:r>
+          </w:p>
+        </w:tc>
+        <w:tc>
+          <w:tcPr>
             <w:tcW w:w="1322" w:type="dxa"/>
           </w:tcPr>
+          <w:p>
+            <w:r>
+              <w:t>09/25/26</w:t>
+            </w:r>
+          </w:p>
+        </w:tc>
+        <w:tc>
+          <w:tcPr>
+            <w:tcW w:w="1516" w:type="dxa"/>
+          </w:tcPr>
+          <w:p>
+            <w:r>
+              <w:t>12:30</w:t>
+            </w:r>
+          </w:p>
+        </w:tc>
+        <w:tc>
+          <w:tcPr>
+            <w:tcW w:w="1635" w:type="dxa"/>
+          </w:tcPr>
+          <w:p>
+            <w:r>
+              <w:t>13:00</w:t>
+            </w:r>
+          </w:p>
+        </w:tc>
+        <w:tc>
+          <w:tcPr>
+            <w:tcW w:w="1511" w:type="dxa"/>
+          </w:tcPr>
+          <w:p>
+            <w:r>
+              <w:t>30 min</w:t>
+            </w:r>
+          </w:p>
+        </w:tc>
+      </w:tr>
+      <w:tr>
+        <w:tc>
+          <w:tcPr>
+            <w:tcW w:w="1819" w:type="dxa"/>
+          </w:tcPr>
           <w:p/>
         </w:tc>
         <w:tc>
           <w:tcPr>
+            <w:tcW w:w="1773" w:type="dxa"/>
+          </w:tcPr>
+          <w:p/>
+        </w:tc>
+        <w:tc>
+          <w:tcPr>
+            <w:tcW w:w="1322" w:type="dxa"/>
+          </w:tcPr>
+          <w:p/>
+        </w:tc>
+        <w:tc>
+          <w:tcPr>
             <w:tcW w:w="1516" w:type="dxa"/>
           </w:tcPr>
           <w:p/>
@@ -594,7 +752,19 @@
           <w:tcPr>
             <w:tcW w:w="1511" w:type="dxa"/>
           </w:tcPr>
-          <w:p/>
+          <w:p>
+            <w:r>
+              <w:t>Week total:</w:t>
+            </w:r>
+          </w:p>
+          <w:p>
+            <w:r>
+              <w:t>240</w:t>
+            </w:r>
+            <w:r>
+              <w:t xml:space="preserve"> min</w:t>
+            </w:r>
+          </w:p>
         </w:tc>
       </w:tr>
     </w:tbl>

</xml_diff>

<commit_message>
Weekly time log update
</commit_message>
<xml_diff>
--- a/docs/Time Log Uliana.docx
+++ b/docs/Time Log Uliana.docx
@@ -1,6 +1,6 @@
 
 <file path=word/document.xml><?xml version="1.0" encoding="utf-8"?>
-<w:document xmlns:wpc="http://schemas.microsoft.com/office/word/2010/wordprocessingCanvas" xmlns:cx="http://schemas.microsoft.com/office/drawing/2014/chartex" xmlns:cx1="http://schemas.microsoft.com/office/drawing/2015/9/8/chartex" xmlns:cx2="http://schemas.microsoft.com/office/drawing/2015/10/21/chartex" xmlns:cx3="http://schemas.microsoft.com/office/drawing/2016/5/9/chartex" xmlns:cx4="http://schemas.microsoft.com/office/drawing/2016/5/10/chartex" xmlns:cx5="http://schemas.microsoft.com/office/drawing/2016/5/11/chartex" xmlns:cx6="http://schemas.microsoft.com/office/drawing/2016/5/12/chartex" xmlns:cx7="http://schemas.microsoft.com/office/drawing/2016/5/13/chartex" xmlns:cx8="http://schemas.microsoft.com/office/drawing/2016/5/14/chartex" xmlns:mc="http://schemas.openxmlformats.org/markup-compatibility/2006" xmlns:aink="http://schemas.microsoft.com/office/drawing/2016/ink" xmlns:am3d="http://schemas.microsoft.com/office/drawing/2017/model3d" xmlns:o="urn:schemas-microsoft-com:office:office" xmlns:r="http://schemas.openxmlformats.org/officeDocument/2006/relationships" xmlns:m="http://schemas.openxmlformats.org/officeDocument/2006/math" xmlns:v="urn:schemas-microsoft-com:vml" xmlns:wp14="http://schemas.microsoft.com/office/word/2010/wordprocessingDrawing" xmlns:wp="http://schemas.openxmlformats.org/drawingml/2006/wordprocessingDrawing" xmlns:w10="urn:schemas-microsoft-com:office:word" xmlns:w="http://schemas.openxmlformats.org/wordprocessingml/2006/main" xmlns:w14="http://schemas.microsoft.com/office/word/2010/wordml" xmlns:w15="http://schemas.microsoft.com/office/word/2012/wordml" xmlns:w16cex="http://schemas.microsoft.com/office/word/2018/wordml/cex" xmlns:w16cid="http://schemas.microsoft.com/office/word/2016/wordml/cid" xmlns:w16="http://schemas.microsoft.com/office/word/2018/wordml" xmlns:w16sdtdh="http://schemas.microsoft.com/office/word/2020/wordml/sdtdatahash" xmlns:w16se="http://schemas.microsoft.com/office/word/2015/wordml/symex" xmlns:wpg="http://schemas.microsoft.com/office/word/2010/wordprocessingGroup" xmlns:wpi="http://schemas.microsoft.com/office/word/2010/wordprocessingInk" xmlns:wne="http://schemas.microsoft.com/office/word/2006/wordml" xmlns:wps="http://schemas.microsoft.com/office/word/2010/wordprocessingShape" mc:Ignorable="w14 w15 w16se w16cid w16 w16cex w16sdtdh wp14">
+<w:document xmlns:wpc="http://schemas.microsoft.com/office/word/2010/wordprocessingCanvas" xmlns:cx="http://schemas.microsoft.com/office/drawing/2014/chartex" xmlns:cx1="http://schemas.microsoft.com/office/drawing/2015/9/8/chartex" xmlns:cx2="http://schemas.microsoft.com/office/drawing/2015/10/21/chartex" xmlns:cx3="http://schemas.microsoft.com/office/drawing/2016/5/9/chartex" xmlns:cx4="http://schemas.microsoft.com/office/drawing/2016/5/10/chartex" xmlns:cx5="http://schemas.microsoft.com/office/drawing/2016/5/11/chartex" xmlns:cx6="http://schemas.microsoft.com/office/drawing/2016/5/12/chartex" xmlns:cx7="http://schemas.microsoft.com/office/drawing/2016/5/13/chartex" xmlns:cx8="http://schemas.microsoft.com/office/drawing/2016/5/14/chartex" xmlns:mc="http://schemas.openxmlformats.org/markup-compatibility/2006" xmlns:aink="http://schemas.microsoft.com/office/drawing/2016/ink" xmlns:am3d="http://schemas.microsoft.com/office/drawing/2017/model3d" xmlns:o="urn:schemas-microsoft-com:office:office" xmlns:oel="http://schemas.microsoft.com/office/2019/extlst" xmlns:r="http://schemas.openxmlformats.org/officeDocument/2006/relationships" xmlns:m="http://schemas.openxmlformats.org/officeDocument/2006/math" xmlns:v="urn:schemas-microsoft-com:vml" xmlns:wp14="http://schemas.microsoft.com/office/word/2010/wordprocessingDrawing" xmlns:wp="http://schemas.openxmlformats.org/drawingml/2006/wordprocessingDrawing" xmlns:w10="urn:schemas-microsoft-com:office:word" xmlns:w="http://schemas.openxmlformats.org/wordprocessingml/2006/main" xmlns:w14="http://schemas.microsoft.com/office/word/2010/wordml" xmlns:w15="http://schemas.microsoft.com/office/word/2012/wordml" xmlns:w16cex="http://schemas.microsoft.com/office/word/2018/wordml/cex" xmlns:w16cid="http://schemas.microsoft.com/office/word/2016/wordml/cid" xmlns:w16="http://schemas.microsoft.com/office/word/2018/wordml" xmlns:w16du="http://schemas.microsoft.com/office/word/2023/wordml/word16du" xmlns:w16sdtdh="http://schemas.microsoft.com/office/word/2020/wordml/sdtdatahash" xmlns:w16sdtfl="http://schemas.microsoft.com/office/word/2024/wordml/sdtformatlock" xmlns:w16se="http://schemas.microsoft.com/office/word/2015/wordml/symex" xmlns:wpg="http://schemas.microsoft.com/office/word/2010/wordprocessingGroup" xmlns:wpi="http://schemas.microsoft.com/office/word/2010/wordprocessingInk" xmlns:wne="http://schemas.microsoft.com/office/word/2006/wordml" xmlns:wps="http://schemas.microsoft.com/office/word/2010/wordprocessingShape" mc:Ignorable="w14 w15 w16se w16cid w16 w16cex w16sdtdh w16sdtfl w16du wp14">
   <w:body>
     <w:p>
       <w:pPr>
@@ -42,7 +42,7 @@
     </w:p>
     <w:tbl>
       <w:tblPr>
-        <w:tblStyle w:val="a"/>
+        <w:tblStyle w:val="a5"/>
         <w:tblW w:w="9576" w:type="dxa"/>
         <w:tblInd w:w="-108" w:type="dxa"/>
         <w:tblBorders>
@@ -759,10 +759,242 @@
           </w:p>
           <w:p>
             <w:r>
-              <w:t>240</w:t>
-            </w:r>
-            <w:r>
-              <w:t xml:space="preserve"> min</w:t>
+              <w:t>240 min</w:t>
+            </w:r>
+          </w:p>
+        </w:tc>
+      </w:tr>
+      <w:tr>
+        <w:tc>
+          <w:tcPr>
+            <w:tcW w:w="1819" w:type="dxa"/>
+          </w:tcPr>
+          <w:p>
+            <w:r>
+              <w:t>Week 3:</w:t>
+            </w:r>
+          </w:p>
+          <w:p>
+            <w:r>
+              <w:t>09/29/26-</w:t>
+            </w:r>
+          </w:p>
+          <w:p>
+            <w:r>
+              <w:t>10/04/26</w:t>
+            </w:r>
+          </w:p>
+        </w:tc>
+        <w:tc>
+          <w:tcPr>
+            <w:tcW w:w="1773" w:type="dxa"/>
+          </w:tcPr>
+          <w:p>
+            <w:r>
+              <w:t>Weekly call</w:t>
+            </w:r>
+          </w:p>
+        </w:tc>
+        <w:tc>
+          <w:tcPr>
+            <w:tcW w:w="1322" w:type="dxa"/>
+          </w:tcPr>
+          <w:p>
+            <w:r>
+              <w:t>10/01/26</w:t>
+            </w:r>
+          </w:p>
+        </w:tc>
+        <w:tc>
+          <w:tcPr>
+            <w:tcW w:w="1516" w:type="dxa"/>
+          </w:tcPr>
+          <w:p>
+            <w:r>
+              <w:t>12:30</w:t>
+            </w:r>
+          </w:p>
+        </w:tc>
+        <w:tc>
+          <w:tcPr>
+            <w:tcW w:w="1635" w:type="dxa"/>
+          </w:tcPr>
+          <w:p>
+            <w:r>
+              <w:t>13:00</w:t>
+            </w:r>
+          </w:p>
+        </w:tc>
+        <w:tc>
+          <w:tcPr>
+            <w:tcW w:w="1511" w:type="dxa"/>
+          </w:tcPr>
+          <w:p>
+            <w:r>
+              <w:t>30 min</w:t>
+            </w:r>
+          </w:p>
+        </w:tc>
+      </w:tr>
+      <w:tr>
+        <w:tc>
+          <w:tcPr>
+            <w:tcW w:w="1819" w:type="dxa"/>
+          </w:tcPr>
+          <w:p/>
+        </w:tc>
+        <w:tc>
+          <w:tcPr>
+            <w:tcW w:w="1773" w:type="dxa"/>
+          </w:tcPr>
+          <w:p>
+            <w:r>
+              <w:t>Object identification</w:t>
+            </w:r>
+          </w:p>
+        </w:tc>
+        <w:tc>
+          <w:tcPr>
+            <w:tcW w:w="1322" w:type="dxa"/>
+          </w:tcPr>
+          <w:p>
+            <w:r>
+              <w:t>10/02/26</w:t>
+            </w:r>
+          </w:p>
+        </w:tc>
+        <w:tc>
+          <w:tcPr>
+            <w:tcW w:w="1516" w:type="dxa"/>
+          </w:tcPr>
+          <w:p>
+            <w:r>
+              <w:t>10:00</w:t>
+            </w:r>
+          </w:p>
+        </w:tc>
+        <w:tc>
+          <w:tcPr>
+            <w:tcW w:w="1635" w:type="dxa"/>
+          </w:tcPr>
+          <w:p>
+            <w:r>
+              <w:t>12:00</w:t>
+            </w:r>
+          </w:p>
+        </w:tc>
+        <w:tc>
+          <w:tcPr>
+            <w:tcW w:w="1511" w:type="dxa"/>
+          </w:tcPr>
+          <w:p>
+            <w:r>
+              <w:t>120 min</w:t>
+            </w:r>
+          </w:p>
+        </w:tc>
+      </w:tr>
+      <w:tr>
+        <w:tc>
+          <w:tcPr>
+            <w:tcW w:w="1819" w:type="dxa"/>
+          </w:tcPr>
+          <w:p/>
+        </w:tc>
+        <w:tc>
+          <w:tcPr>
+            <w:tcW w:w="1773" w:type="dxa"/>
+          </w:tcPr>
+          <w:p>
+            <w:r>
+              <w:t>CRC</w:t>
+            </w:r>
+          </w:p>
+        </w:tc>
+        <w:tc>
+          <w:tcPr>
+            <w:tcW w:w="1322" w:type="dxa"/>
+          </w:tcPr>
+          <w:p>
+            <w:r>
+              <w:t>10/03/26</w:t>
+            </w:r>
+          </w:p>
+        </w:tc>
+        <w:tc>
+          <w:tcPr>
+            <w:tcW w:w="1516" w:type="dxa"/>
+          </w:tcPr>
+          <w:p>
+            <w:r>
+              <w:t>12:00</w:t>
+            </w:r>
+          </w:p>
+        </w:tc>
+        <w:tc>
+          <w:tcPr>
+            <w:tcW w:w="1635" w:type="dxa"/>
+          </w:tcPr>
+          <w:p>
+            <w:r>
+              <w:t>13:00</w:t>
+            </w:r>
+          </w:p>
+        </w:tc>
+        <w:tc>
+          <w:tcPr>
+            <w:tcW w:w="1511" w:type="dxa"/>
+          </w:tcPr>
+          <w:p>
+            <w:r>
+              <w:t>60 min</w:t>
+            </w:r>
+          </w:p>
+        </w:tc>
+      </w:tr>
+      <w:tr>
+        <w:tc>
+          <w:tcPr>
+            <w:tcW w:w="1819" w:type="dxa"/>
+          </w:tcPr>
+          <w:p/>
+        </w:tc>
+        <w:tc>
+          <w:tcPr>
+            <w:tcW w:w="1773" w:type="dxa"/>
+          </w:tcPr>
+          <w:p/>
+        </w:tc>
+        <w:tc>
+          <w:tcPr>
+            <w:tcW w:w="1322" w:type="dxa"/>
+          </w:tcPr>
+          <w:p/>
+        </w:tc>
+        <w:tc>
+          <w:tcPr>
+            <w:tcW w:w="1516" w:type="dxa"/>
+          </w:tcPr>
+          <w:p/>
+        </w:tc>
+        <w:tc>
+          <w:tcPr>
+            <w:tcW w:w="1635" w:type="dxa"/>
+          </w:tcPr>
+          <w:p/>
+        </w:tc>
+        <w:tc>
+          <w:tcPr>
+            <w:tcW w:w="1511" w:type="dxa"/>
+          </w:tcPr>
+          <w:p>
+            <w:r>
+              <w:t>Week total:</w:t>
+            </w:r>
+          </w:p>
+          <w:p>
+            <w:r>
+              <w:t>210 min</w:t>
             </w:r>
           </w:p>
         </w:tc>
@@ -780,7 +1012,7 @@
 </file>
 
 <file path=word/styles.xml><?xml version="1.0" encoding="utf-8"?>
-<w:styles xmlns:mc="http://schemas.openxmlformats.org/markup-compatibility/2006" xmlns:r="http://schemas.openxmlformats.org/officeDocument/2006/relationships" xmlns:w="http://schemas.openxmlformats.org/wordprocessingml/2006/main" xmlns:w14="http://schemas.microsoft.com/office/word/2010/wordml" xmlns:w15="http://schemas.microsoft.com/office/word/2012/wordml" xmlns:w16cex="http://schemas.microsoft.com/office/word/2018/wordml/cex" xmlns:w16cid="http://schemas.microsoft.com/office/word/2016/wordml/cid" xmlns:w16="http://schemas.microsoft.com/office/word/2018/wordml" xmlns:w16sdtdh="http://schemas.microsoft.com/office/word/2020/wordml/sdtdatahash" xmlns:w16se="http://schemas.microsoft.com/office/word/2015/wordml/symex" mc:Ignorable="w14 w15 w16se w16cid w16 w16cex w16sdtdh">
+<w:styles xmlns:mc="http://schemas.openxmlformats.org/markup-compatibility/2006" xmlns:r="http://schemas.openxmlformats.org/officeDocument/2006/relationships" xmlns:w="http://schemas.openxmlformats.org/wordprocessingml/2006/main" xmlns:w14="http://schemas.microsoft.com/office/word/2010/wordml" xmlns:w15="http://schemas.microsoft.com/office/word/2012/wordml" xmlns:w16cex="http://schemas.microsoft.com/office/word/2018/wordml/cex" xmlns:w16cid="http://schemas.microsoft.com/office/word/2016/wordml/cid" xmlns:w16="http://schemas.microsoft.com/office/word/2018/wordml" xmlns:w16du="http://schemas.microsoft.com/office/word/2023/wordml/word16du" xmlns:w16sdtdh="http://schemas.microsoft.com/office/word/2020/wordml/sdtdatahash" xmlns:w16sdtfl="http://schemas.microsoft.com/office/word/2024/wordml/sdtformatlock" xmlns:w16se="http://schemas.microsoft.com/office/word/2015/wordml/symex" mc:Ignorable="w14 w15 w16se w16cid w16 w16cex w16sdtdh w16sdtfl w16du">
   <w:docDefaults>
     <w:rPrDefault>
       <w:rPr>
@@ -1174,14 +1406,14 @@
     <w:lsdException w:name="Unresolved Mention" w:semiHidden="1" w:unhideWhenUsed="1"/>
     <w:lsdException w:name="Smart Link" w:semiHidden="1" w:unhideWhenUsed="1"/>
   </w:latentStyles>
-  <w:style w:type="paragraph" w:default="1" w:styleId="Normal">
+  <w:style w:type="paragraph" w:default="1" w:styleId="a">
     <w:name w:val="Normal"/>
     <w:qFormat/>
   </w:style>
-  <w:style w:type="paragraph" w:styleId="Heading1">
+  <w:style w:type="paragraph" w:styleId="1">
     <w:name w:val="heading 1"/>
-    <w:basedOn w:val="Normal"/>
-    <w:next w:val="Normal"/>
+    <w:basedOn w:val="a"/>
+    <w:next w:val="a"/>
     <w:uiPriority w:val="9"/>
     <w:qFormat/>
     <w:pPr>
@@ -1197,10 +1429,10 @@
       <w:szCs w:val="48"/>
     </w:rPr>
   </w:style>
-  <w:style w:type="paragraph" w:styleId="Heading2">
+  <w:style w:type="paragraph" w:styleId="2">
     <w:name w:val="heading 2"/>
-    <w:basedOn w:val="Normal"/>
-    <w:next w:val="Normal"/>
+    <w:basedOn w:val="a"/>
+    <w:next w:val="a"/>
     <w:uiPriority w:val="9"/>
     <w:semiHidden/>
     <w:unhideWhenUsed/>
@@ -1218,10 +1450,10 @@
       <w:szCs w:val="36"/>
     </w:rPr>
   </w:style>
-  <w:style w:type="paragraph" w:styleId="Heading3">
+  <w:style w:type="paragraph" w:styleId="3">
     <w:name w:val="heading 3"/>
-    <w:basedOn w:val="Normal"/>
-    <w:next w:val="Normal"/>
+    <w:basedOn w:val="a"/>
+    <w:next w:val="a"/>
     <w:uiPriority w:val="9"/>
     <w:semiHidden/>
     <w:unhideWhenUsed/>
@@ -1239,10 +1471,10 @@
       <w:szCs w:val="28"/>
     </w:rPr>
   </w:style>
-  <w:style w:type="paragraph" w:styleId="Heading4">
+  <w:style w:type="paragraph" w:styleId="4">
     <w:name w:val="heading 4"/>
-    <w:basedOn w:val="Normal"/>
-    <w:next w:val="Normal"/>
+    <w:basedOn w:val="a"/>
+    <w:next w:val="a"/>
     <w:uiPriority w:val="9"/>
     <w:semiHidden/>
     <w:unhideWhenUsed/>
@@ -1260,10 +1492,10 @@
       <w:szCs w:val="24"/>
     </w:rPr>
   </w:style>
-  <w:style w:type="paragraph" w:styleId="Heading5">
+  <w:style w:type="paragraph" w:styleId="5">
     <w:name w:val="heading 5"/>
-    <w:basedOn w:val="Normal"/>
-    <w:next w:val="Normal"/>
+    <w:basedOn w:val="a"/>
+    <w:next w:val="a"/>
     <w:uiPriority w:val="9"/>
     <w:semiHidden/>
     <w:unhideWhenUsed/>
@@ -1279,10 +1511,10 @@
       <w:bCs/>
     </w:rPr>
   </w:style>
-  <w:style w:type="paragraph" w:styleId="Heading6">
+  <w:style w:type="paragraph" w:styleId="6">
     <w:name w:val="heading 6"/>
-    <w:basedOn w:val="Normal"/>
-    <w:next w:val="Normal"/>
+    <w:basedOn w:val="a"/>
+    <w:next w:val="a"/>
     <w:uiPriority w:val="9"/>
     <w:semiHidden/>
     <w:unhideWhenUsed/>
@@ -1300,13 +1532,13 @@
       <w:szCs w:val="20"/>
     </w:rPr>
   </w:style>
-  <w:style w:type="character" w:default="1" w:styleId="DefaultParagraphFont">
+  <w:style w:type="character" w:default="1" w:styleId="a0">
     <w:name w:val="Default Paragraph Font"/>
     <w:uiPriority w:val="1"/>
     <w:semiHidden/>
     <w:unhideWhenUsed/>
   </w:style>
-  <w:style w:type="table" w:default="1" w:styleId="TableNormal">
+  <w:style w:type="table" w:default="1" w:styleId="a1">
     <w:name w:val="Normal Table"/>
     <w:uiPriority w:val="99"/>
     <w:semiHidden/>
@@ -1321,13 +1553,13 @@
       </w:tblCellMar>
     </w:tblPr>
   </w:style>
-  <w:style w:type="numbering" w:default="1" w:styleId="NoList">
+  <w:style w:type="numbering" w:default="1" w:styleId="a2">
     <w:name w:val="No List"/>
     <w:uiPriority w:val="99"/>
     <w:semiHidden/>
     <w:unhideWhenUsed/>
   </w:style>
-  <w:style w:type="table" w:customStyle="1" w:styleId="TableNormal0">
+  <w:style w:type="table" w:customStyle="1" w:styleId="TableNormal">
     <w:name w:val="TableNormal"/>
     <w:tblPr>
       <w:tblCellMar>
@@ -1338,10 +1570,10 @@
       </w:tblCellMar>
     </w:tblPr>
   </w:style>
-  <w:style w:type="paragraph" w:styleId="Title">
+  <w:style w:type="paragraph" w:styleId="a3">
     <w:name w:val="Title"/>
-    <w:basedOn w:val="Normal"/>
-    <w:next w:val="Normal"/>
+    <w:basedOn w:val="a"/>
+    <w:next w:val="a"/>
     <w:uiPriority w:val="10"/>
     <w:qFormat/>
     <w:pPr>
@@ -1356,10 +1588,10 @@
       <w:szCs w:val="72"/>
     </w:rPr>
   </w:style>
-  <w:style w:type="paragraph" w:styleId="Subtitle">
+  <w:style w:type="paragraph" w:styleId="a4">
     <w:name w:val="Subtitle"/>
-    <w:basedOn w:val="Normal"/>
-    <w:next w:val="Normal"/>
+    <w:basedOn w:val="a"/>
+    <w:next w:val="a"/>
     <w:uiPriority w:val="11"/>
     <w:qFormat/>
     <w:pPr>
@@ -1376,8 +1608,8 @@
       <w:szCs w:val="48"/>
     </w:rPr>
   </w:style>
-  <w:style w:type="table" w:customStyle="1" w:styleId="a">
-    <w:basedOn w:val="TableNormal0"/>
+  <w:style w:type="table" w:customStyle="1" w:styleId="a5">
+    <w:basedOn w:val="TableNormal"/>
     <w:pPr>
       <w:spacing w:after="0" w:line="240" w:lineRule="auto"/>
     </w:pPr>

</xml_diff>

<commit_message>
first commit of phase 2 initial code snippet
</commit_message>
<xml_diff>
--- a/docs/Time Log Uliana.docx
+++ b/docs/Time Log Uliana.docx
@@ -35,11 +35,6 @@
         <w:t xml:space="preserve">Project LMS: </w:t>
       </w:r>
     </w:p>
-    <w:p>
-      <w:pPr>
-        <w:jc w:val="center"/>
-      </w:pPr>
-    </w:p>
     <w:tbl>
       <w:tblPr>
         <w:tblStyle w:val="a"/>
@@ -759,10 +754,778 @@
           </w:p>
           <w:p>
             <w:r>
-              <w:t>240</w:t>
-            </w:r>
-            <w:r>
-              <w:t xml:space="preserve"> min</w:t>
+              <w:t>240 min</w:t>
+            </w:r>
+          </w:p>
+        </w:tc>
+      </w:tr>
+      <w:tr>
+        <w:tc>
+          <w:tcPr>
+            <w:tcW w:w="1819" w:type="dxa"/>
+          </w:tcPr>
+          <w:p>
+            <w:r>
+              <w:t>Week 3:</w:t>
+            </w:r>
+          </w:p>
+          <w:p>
+            <w:r>
+              <w:t>09/29/26-</w:t>
+            </w:r>
+          </w:p>
+          <w:p>
+            <w:r>
+              <w:t>10/04/26</w:t>
+            </w:r>
+          </w:p>
+        </w:tc>
+        <w:tc>
+          <w:tcPr>
+            <w:tcW w:w="1773" w:type="dxa"/>
+          </w:tcPr>
+          <w:p>
+            <w:r>
+              <w:t>Weekly call</w:t>
+            </w:r>
+          </w:p>
+        </w:tc>
+        <w:tc>
+          <w:tcPr>
+            <w:tcW w:w="1322" w:type="dxa"/>
+          </w:tcPr>
+          <w:p>
+            <w:r>
+              <w:t>10/01/26</w:t>
+            </w:r>
+          </w:p>
+        </w:tc>
+        <w:tc>
+          <w:tcPr>
+            <w:tcW w:w="1516" w:type="dxa"/>
+          </w:tcPr>
+          <w:p>
+            <w:r>
+              <w:t>12:30</w:t>
+            </w:r>
+          </w:p>
+        </w:tc>
+        <w:tc>
+          <w:tcPr>
+            <w:tcW w:w="1635" w:type="dxa"/>
+          </w:tcPr>
+          <w:p>
+            <w:r>
+              <w:t>13:00</w:t>
+            </w:r>
+          </w:p>
+        </w:tc>
+        <w:tc>
+          <w:tcPr>
+            <w:tcW w:w="1511" w:type="dxa"/>
+          </w:tcPr>
+          <w:p>
+            <w:r>
+              <w:t>30 min</w:t>
+            </w:r>
+          </w:p>
+        </w:tc>
+      </w:tr>
+      <w:tr>
+        <w:tc>
+          <w:tcPr>
+            <w:tcW w:w="1819" w:type="dxa"/>
+          </w:tcPr>
+          <w:p/>
+        </w:tc>
+        <w:tc>
+          <w:tcPr>
+            <w:tcW w:w="1773" w:type="dxa"/>
+          </w:tcPr>
+          <w:p>
+            <w:r>
+              <w:t>Object identification</w:t>
+            </w:r>
+          </w:p>
+        </w:tc>
+        <w:tc>
+          <w:tcPr>
+            <w:tcW w:w="1322" w:type="dxa"/>
+          </w:tcPr>
+          <w:p>
+            <w:r>
+              <w:t>10/02/26</w:t>
+            </w:r>
+          </w:p>
+        </w:tc>
+        <w:tc>
+          <w:tcPr>
+            <w:tcW w:w="1516" w:type="dxa"/>
+          </w:tcPr>
+          <w:p>
+            <w:r>
+              <w:t>10:00</w:t>
+            </w:r>
+          </w:p>
+        </w:tc>
+        <w:tc>
+          <w:tcPr>
+            <w:tcW w:w="1635" w:type="dxa"/>
+          </w:tcPr>
+          <w:p>
+            <w:r>
+              <w:t>12:00</w:t>
+            </w:r>
+          </w:p>
+        </w:tc>
+        <w:tc>
+          <w:tcPr>
+            <w:tcW w:w="1511" w:type="dxa"/>
+          </w:tcPr>
+          <w:p>
+            <w:r>
+              <w:t>120 min</w:t>
+            </w:r>
+          </w:p>
+        </w:tc>
+      </w:tr>
+      <w:tr>
+        <w:tc>
+          <w:tcPr>
+            <w:tcW w:w="1819" w:type="dxa"/>
+          </w:tcPr>
+          <w:p/>
+        </w:tc>
+        <w:tc>
+          <w:tcPr>
+            <w:tcW w:w="1773" w:type="dxa"/>
+          </w:tcPr>
+          <w:p>
+            <w:r>
+              <w:t>CRC</w:t>
+            </w:r>
+          </w:p>
+        </w:tc>
+        <w:tc>
+          <w:tcPr>
+            <w:tcW w:w="1322" w:type="dxa"/>
+          </w:tcPr>
+          <w:p>
+            <w:r>
+              <w:t>10/03/26</w:t>
+            </w:r>
+          </w:p>
+        </w:tc>
+        <w:tc>
+          <w:tcPr>
+            <w:tcW w:w="1516" w:type="dxa"/>
+          </w:tcPr>
+          <w:p>
+            <w:r>
+              <w:t>12:00</w:t>
+            </w:r>
+          </w:p>
+        </w:tc>
+        <w:tc>
+          <w:tcPr>
+            <w:tcW w:w="1635" w:type="dxa"/>
+          </w:tcPr>
+          <w:p>
+            <w:r>
+              <w:t>13:00</w:t>
+            </w:r>
+          </w:p>
+        </w:tc>
+        <w:tc>
+          <w:tcPr>
+            <w:tcW w:w="1511" w:type="dxa"/>
+          </w:tcPr>
+          <w:p>
+            <w:r>
+              <w:t>60 min</w:t>
+            </w:r>
+          </w:p>
+        </w:tc>
+      </w:tr>
+      <w:tr>
+        <w:tc>
+          <w:tcPr>
+            <w:tcW w:w="1819" w:type="dxa"/>
+          </w:tcPr>
+          <w:p/>
+        </w:tc>
+        <w:tc>
+          <w:tcPr>
+            <w:tcW w:w="1773" w:type="dxa"/>
+          </w:tcPr>
+          <w:p/>
+        </w:tc>
+        <w:tc>
+          <w:tcPr>
+            <w:tcW w:w="1322" w:type="dxa"/>
+          </w:tcPr>
+          <w:p/>
+        </w:tc>
+        <w:tc>
+          <w:tcPr>
+            <w:tcW w:w="1516" w:type="dxa"/>
+          </w:tcPr>
+          <w:p/>
+        </w:tc>
+        <w:tc>
+          <w:tcPr>
+            <w:tcW w:w="1635" w:type="dxa"/>
+          </w:tcPr>
+          <w:p/>
+        </w:tc>
+        <w:tc>
+          <w:tcPr>
+            <w:tcW w:w="1511" w:type="dxa"/>
+          </w:tcPr>
+          <w:p>
+            <w:r>
+              <w:t>Week total:</w:t>
+            </w:r>
+          </w:p>
+          <w:p>
+            <w:r>
+              <w:t>210 min</w:t>
+            </w:r>
+          </w:p>
+        </w:tc>
+      </w:tr>
+      <w:tr>
+        <w:tc>
+          <w:tcPr>
+            <w:tcW w:w="1819" w:type="dxa"/>
+          </w:tcPr>
+          <w:p>
+            <w:r>
+              <w:t xml:space="preserve">Week 4: </w:t>
+            </w:r>
+          </w:p>
+          <w:p>
+            <w:r>
+              <w:t>10/05/26-</w:t>
+            </w:r>
+          </w:p>
+          <w:p>
+            <w:r>
+              <w:t>10/11/26</w:t>
+            </w:r>
+          </w:p>
+        </w:tc>
+        <w:tc>
+          <w:tcPr>
+            <w:tcW w:w="1773" w:type="dxa"/>
+          </w:tcPr>
+          <w:p>
+            <w:r>
+              <w:t>Report formatting</w:t>
+            </w:r>
+          </w:p>
+        </w:tc>
+        <w:tc>
+          <w:tcPr>
+            <w:tcW w:w="1322" w:type="dxa"/>
+          </w:tcPr>
+          <w:p>
+            <w:r>
+              <w:t>09/10/26</w:t>
+            </w:r>
+          </w:p>
+        </w:tc>
+        <w:tc>
+          <w:tcPr>
+            <w:tcW w:w="1516" w:type="dxa"/>
+          </w:tcPr>
+          <w:p>
+            <w:r>
+              <w:t>10:00</w:t>
+            </w:r>
+          </w:p>
+        </w:tc>
+        <w:tc>
+          <w:tcPr>
+            <w:tcW w:w="1635" w:type="dxa"/>
+          </w:tcPr>
+          <w:p>
+            <w:r>
+              <w:t>10:30</w:t>
+            </w:r>
+          </w:p>
+        </w:tc>
+        <w:tc>
+          <w:tcPr>
+            <w:tcW w:w="1511" w:type="dxa"/>
+          </w:tcPr>
+          <w:p>
+            <w:r>
+              <w:t>30 min</w:t>
+            </w:r>
+          </w:p>
+        </w:tc>
+      </w:tr>
+      <w:tr>
+        <w:tc>
+          <w:tcPr>
+            <w:tcW w:w="1819" w:type="dxa"/>
+          </w:tcPr>
+          <w:p/>
+        </w:tc>
+        <w:tc>
+          <w:tcPr>
+            <w:tcW w:w="1773" w:type="dxa"/>
+          </w:tcPr>
+          <w:p>
+            <w:r>
+              <w:t>Use Case Confirmation</w:t>
+            </w:r>
+          </w:p>
+        </w:tc>
+        <w:tc>
+          <w:tcPr>
+            <w:tcW w:w="1322" w:type="dxa"/>
+          </w:tcPr>
+          <w:p>
+            <w:r>
+              <w:t>10/10/26</w:t>
+            </w:r>
+          </w:p>
+        </w:tc>
+        <w:tc>
+          <w:tcPr>
+            <w:tcW w:w="1516" w:type="dxa"/>
+          </w:tcPr>
+          <w:p>
+            <w:r>
+              <w:t>10:30</w:t>
+            </w:r>
+          </w:p>
+        </w:tc>
+        <w:tc>
+          <w:tcPr>
+            <w:tcW w:w="1635" w:type="dxa"/>
+          </w:tcPr>
+          <w:p>
+            <w:r>
+              <w:t>12:30</w:t>
+            </w:r>
+          </w:p>
+        </w:tc>
+        <w:tc>
+          <w:tcPr>
+            <w:tcW w:w="1511" w:type="dxa"/>
+          </w:tcPr>
+          <w:p>
+            <w:r>
+              <w:t>120 min</w:t>
+            </w:r>
+          </w:p>
+        </w:tc>
+      </w:tr>
+      <w:tr>
+        <w:tc>
+          <w:tcPr>
+            <w:tcW w:w="1819" w:type="dxa"/>
+          </w:tcPr>
+          <w:p/>
+        </w:tc>
+        <w:tc>
+          <w:tcPr>
+            <w:tcW w:w="1773" w:type="dxa"/>
+          </w:tcPr>
+          <w:p>
+            <w:r>
+              <w:t>Object identification</w:t>
+            </w:r>
+          </w:p>
+        </w:tc>
+        <w:tc>
+          <w:tcPr>
+            <w:tcW w:w="1322" w:type="dxa"/>
+          </w:tcPr>
+          <w:p>
+            <w:r>
+              <w:t>10/10/26</w:t>
+            </w:r>
+          </w:p>
+        </w:tc>
+        <w:tc>
+          <w:tcPr>
+            <w:tcW w:w="1516" w:type="dxa"/>
+          </w:tcPr>
+          <w:p>
+            <w:r>
+              <w:t>12:30</w:t>
+            </w:r>
+          </w:p>
+        </w:tc>
+        <w:tc>
+          <w:tcPr>
+            <w:tcW w:w="1635" w:type="dxa"/>
+          </w:tcPr>
+          <w:p>
+            <w:r>
+              <w:t>14:00</w:t>
+            </w:r>
+          </w:p>
+        </w:tc>
+        <w:tc>
+          <w:tcPr>
+            <w:tcW w:w="1511" w:type="dxa"/>
+          </w:tcPr>
+          <w:p>
+            <w:r>
+              <w:t>90 min</w:t>
+            </w:r>
+          </w:p>
+        </w:tc>
+      </w:tr>
+      <w:tr>
+        <w:tc>
+          <w:tcPr>
+            <w:tcW w:w="1819" w:type="dxa"/>
+          </w:tcPr>
+          <w:p/>
+        </w:tc>
+        <w:tc>
+          <w:tcPr>
+            <w:tcW w:w="1773" w:type="dxa"/>
+          </w:tcPr>
+          <w:p>
+            <w:r>
+              <w:t>CRC</w:t>
+            </w:r>
+          </w:p>
+        </w:tc>
+        <w:tc>
+          <w:tcPr>
+            <w:tcW w:w="1322" w:type="dxa"/>
+          </w:tcPr>
+          <w:p>
+            <w:r>
+              <w:t>11/10/26</w:t>
+            </w:r>
+          </w:p>
+        </w:tc>
+        <w:tc>
+          <w:tcPr>
+            <w:tcW w:w="1516" w:type="dxa"/>
+          </w:tcPr>
+          <w:p>
+            <w:r>
+              <w:t>10:00</w:t>
+            </w:r>
+          </w:p>
+        </w:tc>
+        <w:tc>
+          <w:tcPr>
+            <w:tcW w:w="1635" w:type="dxa"/>
+          </w:tcPr>
+          <w:p>
+            <w:r>
+              <w:t>11:30</w:t>
+            </w:r>
+          </w:p>
+        </w:tc>
+        <w:tc>
+          <w:tcPr>
+            <w:tcW w:w="1511" w:type="dxa"/>
+          </w:tcPr>
+          <w:p>
+            <w:r>
+              <w:t>90 min</w:t>
+            </w:r>
+          </w:p>
+        </w:tc>
+      </w:tr>
+      <w:tr>
+        <w:tc>
+          <w:tcPr>
+            <w:tcW w:w="1819" w:type="dxa"/>
+          </w:tcPr>
+          <w:p/>
+        </w:tc>
+        <w:tc>
+          <w:tcPr>
+            <w:tcW w:w="1773" w:type="dxa"/>
+          </w:tcPr>
+          <w:p/>
+        </w:tc>
+        <w:tc>
+          <w:tcPr>
+            <w:tcW w:w="1322" w:type="dxa"/>
+          </w:tcPr>
+          <w:p/>
+        </w:tc>
+        <w:tc>
+          <w:tcPr>
+            <w:tcW w:w="1516" w:type="dxa"/>
+          </w:tcPr>
+          <w:p/>
+        </w:tc>
+        <w:tc>
+          <w:tcPr>
+            <w:tcW w:w="1635" w:type="dxa"/>
+          </w:tcPr>
+          <w:p/>
+        </w:tc>
+        <w:tc>
+          <w:tcPr>
+            <w:tcW w:w="1511" w:type="dxa"/>
+          </w:tcPr>
+          <w:p>
+            <w:r>
+              <w:t>Week total: 330 min</w:t>
+            </w:r>
+          </w:p>
+        </w:tc>
+      </w:tr>
+      <w:tr>
+        <w:trPr>
+          <w:trHeight w:val="1923"/>
+        </w:trPr>
+        <w:tc>
+          <w:tcPr>
+            <w:tcW w:w="1819" w:type="dxa"/>
+          </w:tcPr>
+          <w:p>
+            <w:r>
+              <w:lastRenderedPageBreak/>
+              <w:t>Week 5:</w:t>
+            </w:r>
+          </w:p>
+          <w:p>
+            <w:r>
+              <w:t>10/12/26-</w:t>
+            </w:r>
+          </w:p>
+          <w:p>
+            <w:r>
+              <w:t>10/18/26</w:t>
+            </w:r>
+          </w:p>
+        </w:tc>
+        <w:tc>
+          <w:tcPr>
+            <w:tcW w:w="1773" w:type="dxa"/>
+          </w:tcPr>
+          <w:p>
+            <w:r>
+              <w:t>CRC Development</w:t>
+            </w:r>
+          </w:p>
+        </w:tc>
+        <w:tc>
+          <w:tcPr>
+            <w:tcW w:w="1322" w:type="dxa"/>
+          </w:tcPr>
+          <w:p>
+            <w:r>
+              <w:t>10/15/26</w:t>
+            </w:r>
+          </w:p>
+        </w:tc>
+        <w:tc>
+          <w:tcPr>
+            <w:tcW w:w="1516" w:type="dxa"/>
+          </w:tcPr>
+          <w:p>
+            <w:r>
+              <w:t>10:00</w:t>
+            </w:r>
+          </w:p>
+        </w:tc>
+        <w:tc>
+          <w:tcPr>
+            <w:tcW w:w="1635" w:type="dxa"/>
+          </w:tcPr>
+          <w:p>
+            <w:r>
+              <w:t>13:00</w:t>
+            </w:r>
+          </w:p>
+        </w:tc>
+        <w:tc>
+          <w:tcPr>
+            <w:tcW w:w="1511" w:type="dxa"/>
+          </w:tcPr>
+          <w:p>
+            <w:r>
+              <w:t>180 min</w:t>
+            </w:r>
+          </w:p>
+        </w:tc>
+      </w:tr>
+      <w:tr>
+        <w:trPr>
+          <w:trHeight w:val="1923"/>
+        </w:trPr>
+        <w:tc>
+          <w:tcPr>
+            <w:tcW w:w="1819" w:type="dxa"/>
+          </w:tcPr>
+          <w:p/>
+        </w:tc>
+        <w:tc>
+          <w:tcPr>
+            <w:tcW w:w="1773" w:type="dxa"/>
+          </w:tcPr>
+          <w:p>
+            <w:r>
+              <w:t>Report Formatting</w:t>
+            </w:r>
+          </w:p>
+        </w:tc>
+        <w:tc>
+          <w:tcPr>
+            <w:tcW w:w="1322" w:type="dxa"/>
+          </w:tcPr>
+          <w:p>
+            <w:r>
+              <w:t>10/16/26</w:t>
+            </w:r>
+          </w:p>
+        </w:tc>
+        <w:tc>
+          <w:tcPr>
+            <w:tcW w:w="1516" w:type="dxa"/>
+          </w:tcPr>
+          <w:p>
+            <w:r>
+              <w:t>10:00</w:t>
+            </w:r>
+          </w:p>
+        </w:tc>
+        <w:tc>
+          <w:tcPr>
+            <w:tcW w:w="1635" w:type="dxa"/>
+          </w:tcPr>
+          <w:p>
+            <w:r>
+              <w:t>11:00</w:t>
+            </w:r>
+          </w:p>
+        </w:tc>
+        <w:tc>
+          <w:tcPr>
+            <w:tcW w:w="1511" w:type="dxa"/>
+          </w:tcPr>
+          <w:p>
+            <w:r>
+              <w:t>60 min</w:t>
+            </w:r>
+          </w:p>
+        </w:tc>
+      </w:tr>
+      <w:tr>
+        <w:trPr>
+          <w:trHeight w:val="1923"/>
+        </w:trPr>
+        <w:tc>
+          <w:tcPr>
+            <w:tcW w:w="1819" w:type="dxa"/>
+          </w:tcPr>
+          <w:p/>
+        </w:tc>
+        <w:tc>
+          <w:tcPr>
+            <w:tcW w:w="1773" w:type="dxa"/>
+          </w:tcPr>
+          <w:p>
+            <w:r>
+              <w:t>Use Cases and UML Alignment</w:t>
+            </w:r>
+          </w:p>
+        </w:tc>
+        <w:tc>
+          <w:tcPr>
+            <w:tcW w:w="1322" w:type="dxa"/>
+          </w:tcPr>
+          <w:p>
+            <w:r>
+              <w:t>10/16/26</w:t>
+            </w:r>
+          </w:p>
+        </w:tc>
+        <w:tc>
+          <w:tcPr>
+            <w:tcW w:w="1516" w:type="dxa"/>
+          </w:tcPr>
+          <w:p>
+            <w:r>
+              <w:t>11:00</w:t>
+            </w:r>
+          </w:p>
+        </w:tc>
+        <w:tc>
+          <w:tcPr>
+            <w:tcW w:w="1635" w:type="dxa"/>
+          </w:tcPr>
+          <w:p>
+            <w:r>
+              <w:t>13:00</w:t>
+            </w:r>
+          </w:p>
+        </w:tc>
+        <w:tc>
+          <w:tcPr>
+            <w:tcW w:w="1511" w:type="dxa"/>
+          </w:tcPr>
+          <w:p>
+            <w:r>
+              <w:t>120 min</w:t>
+            </w:r>
+          </w:p>
+        </w:tc>
+      </w:tr>
+      <w:tr>
+        <w:trPr>
+          <w:trHeight w:val="1923"/>
+        </w:trPr>
+        <w:tc>
+          <w:tcPr>
+            <w:tcW w:w="1819" w:type="dxa"/>
+          </w:tcPr>
+          <w:p/>
+        </w:tc>
+        <w:tc>
+          <w:tcPr>
+            <w:tcW w:w="1773" w:type="dxa"/>
+          </w:tcPr>
+          <w:p/>
+        </w:tc>
+        <w:tc>
+          <w:tcPr>
+            <w:tcW w:w="1322" w:type="dxa"/>
+          </w:tcPr>
+          <w:p/>
+        </w:tc>
+        <w:tc>
+          <w:tcPr>
+            <w:tcW w:w="1516" w:type="dxa"/>
+          </w:tcPr>
+          <w:p/>
+        </w:tc>
+        <w:tc>
+          <w:tcPr>
+            <w:tcW w:w="1635" w:type="dxa"/>
+          </w:tcPr>
+          <w:p/>
+        </w:tc>
+        <w:tc>
+          <w:tcPr>
+            <w:tcW w:w="1511" w:type="dxa"/>
+          </w:tcPr>
+          <w:p>
+            <w:r>
+              <w:t>Week total:</w:t>
+            </w:r>
+          </w:p>
+          <w:p>
+            <w:r>
+              <w:t>360 min</w:t>
             </w:r>
           </w:p>
         </w:tc>

</xml_diff>